<commit_message>
Clarify consolidated source archive and record definitions
</commit_message>
<xml_diff>
--- a/docs/Data_source_and_use_statement.docx
+++ b/docs/Data_source_and_use_statement.docx
@@ -321,7 +321,7 @@
     </w:p>
     <w:p>
       <w:r>
-        <w:t>组织地址为 https://github.com/PROBE-benchmark/PROBE-benchmark，迁移保留私有状态。代码包不包含31控制器的理想结果。三份运行器不使用的元数据文件 source_metadata.json、sources.json 和 scenario_design.json 从运行发行包移出，原件与哈希保存在随附来源档案中，Git历史仍保留。160份科学数据文件未改动；只更新发行清单、文档和契约测试。归档MiMo实际输出上限8,192 tokens，thinking为false；配置的token-plan费用字段不是理想队列按公共单价计算的美元费用。</w:t>
+        <w:t>组织地址为 https://github.com/PROBE-benchmark/PROBE-benchmark，迁移保留私有状态。代码包不包含31控制器的理想结果。三份运行器不使用的元数据文件 source_metadata.json、sources.json 和 scenario_design.json 从运行发行包移出，原件仍保存在迁移后的Git历史（前一提交006e19e）中，本文件保留其SHA256。160份科学数据文件未改动；只更新发行清单、文档和契约测试。归档MiMo实际输出上限8,192 tokens，thinking为false；配置的token-plan费用字段不是理想队列按公共单价计算的美元费用。</w:t>
       </w:r>
     </w:p>
     <w:p>
@@ -347,6 +347,11 @@
     <w:p>
       <w:r>
         <w:t>source_distance_m 在新工作簿中是 min_distance_to_surface_3d_m 的同值兼容列，来自当前参考坐标到注册源面集合的几何距离；不能把它称为31个商业模型的真实定位误差。SYN-Mxx及run_id是用于联表的稳定标识，予以保留。来源字段的说明集中于本文件，不改变数据的派生性质。</w:t>
+      </w:r>
+    </w:p>
+    <w:p>
+      <w:r>
+        <w:t>文件标识的处理：工作簿和配套分析表省去重复的data_class及早期商业模型版式标签，保留SYN-Mxx、run_id和来源联表键。详细性质集中于本Word；原始来源状态、加工参数以及修订稿中被删除的旧文字仍可追溯，不因整理排版而改称现场记录。</w:t>
       </w:r>
     </w:p>
     <w:sectPr>

</xml_diff>

<commit_message>
Use portable Chinese typography in consolidated provenance
</commit_message>
<xml_diff>
--- a/docs/Data_source_and_use_statement.docx
+++ b/docs/Data_source_and_use_statement.docx
@@ -731,7 +731,7 @@
       <w:spacing w:after="120"/>
     </w:pPr>
     <w:rPr>
-      <w:rFonts w:ascii="Arial" w:hAnsi="Arial" w:eastAsia="PingFang SC"/>
+      <w:rFonts w:ascii="Arial Unicode MS" w:hAnsi="Arial Unicode MS" w:eastAsia="Arial Unicode MS"/>
       <w:color w:val="000000"/>
       <w:sz w:val="21"/>
     </w:rPr>
@@ -795,7 +795,7 @@
       <w:outlineLvl w:val="0"/>
     </w:pPr>
     <w:rPr>
-      <w:rFonts w:asciiTheme="majorHAnsi" w:eastAsiaTheme="majorEastAsia" w:hAnsiTheme="majorHAnsi" w:cstheme="majorBidi" w:ascii="Arial" w:hAnsi="Arial" w:eastAsia="PingFang SC"/>
+      <w:rFonts w:asciiTheme="majorHAnsi" w:eastAsiaTheme="majorEastAsia" w:hAnsiTheme="majorHAnsi" w:cstheme="majorBidi" w:ascii="Arial Unicode MS" w:hAnsi="Arial Unicode MS" w:eastAsia="Arial Unicode MS"/>
       <w:b/>
       <w:bCs/>
       <w:color w:val="000000"/>
@@ -819,7 +819,7 @@
       <w:outlineLvl w:val="1"/>
     </w:pPr>
     <w:rPr>
-      <w:rFonts w:asciiTheme="majorHAnsi" w:eastAsiaTheme="majorEastAsia" w:hAnsiTheme="majorHAnsi" w:cstheme="majorBidi" w:ascii="Arial" w:hAnsi="Arial" w:eastAsia="PingFang SC"/>
+      <w:rFonts w:asciiTheme="majorHAnsi" w:eastAsiaTheme="majorEastAsia" w:hAnsiTheme="majorHAnsi" w:cstheme="majorBidi" w:ascii="Arial Unicode MS" w:hAnsi="Arial Unicode MS" w:eastAsia="Arial Unicode MS"/>
       <w:b/>
       <w:bCs/>
       <w:color w:val="000000"/>
@@ -1084,7 +1084,7 @@
       <w:contextualSpacing/>
     </w:pPr>
     <w:rPr>
-      <w:rFonts w:asciiTheme="majorHAnsi" w:eastAsiaTheme="majorEastAsia" w:hAnsiTheme="majorHAnsi" w:cstheme="majorBidi" w:ascii="Arial" w:hAnsi="Arial" w:eastAsia="PingFang SC"/>
+      <w:rFonts w:asciiTheme="majorHAnsi" w:eastAsiaTheme="majorEastAsia" w:hAnsiTheme="majorHAnsi" w:cstheme="majorBidi" w:ascii="Arial Unicode MS" w:hAnsi="Arial Unicode MS" w:eastAsia="Arial Unicode MS"/>
       <w:color w:val="000000"/>
       <w:spacing w:val="5"/>
       <w:kern w:val="28"/>

</xml_diff>